<commit_message>
Update resume: corrected wmux contribution record, Figma, Tailscale/OpenSSH
</commit_message>
<xml_diff>
--- a/public/Aadarsh_Upadhyay_Resume.docx
+++ b/public/Aadarsh_Upadhyay_Resume.docx
@@ -122,7 +122,7 @@
         <w:pStyle w:val="FirstParagraph"/>
       </w:pPr>
       <w:r>
-        <w:t xml:space="preserve">Software engineer and architect who owns systems end to end: architecture, core build, and direct client delivery. My sweet spot is forward-deployed-style work: take a vague client ask, tinker until I find what the client and the system actually want, and ship it as a production feature. Most recently the primary engineer and architect of an agentic AI compliance SaaS, where I authored 84% of the codebase. Nights and weekends I ship open-source developer tools with real releases on PyPI, npm, and signed APKs.</w:t>
+        <w:t xml:space="preserve">Software engineer and architect who owns systems end to end: architecture, core build, and direct client delivery. My sweet spot is forward-deployed-style work: take a vague client ask, tinker until I find what the client and the system actually want, and ship it as a production feature. Most recently the primary engineer and architect of an agentic AI compliance SaaS; 84% of its commits are mine. Nights and weekends I ship open-source developer tools with real releases on PyPI, npm, and signed APKs.</w:t>
       </w:r>
     </w:p>
     <w:bookmarkEnd w:id="13"/>
@@ -209,7 +209,7 @@
         </w:numPr>
       </w:pPr>
       <w:r>
-        <w:t xml:space="preserve">Integrated industry-level AI across every document and artifact surface: a meeting-minutes AI pipeline (SS-1/SS-2-compliant minutes for Board/AGM/EGM/Committee), 70+ AI-drafted statutory document types, resolution and report draft pipelines, and resilient chat generation that survives navigation and full reload.</w:t>
+        <w:t xml:space="preserve">Shipped AI drafting across the document stack: a meeting-minutes pipeline (SS-1/SS-2-compliant minutes for Board/AGM/EGM/Committee), 70+ AI-drafted statutory document types, resolution and report draft pipelines, and chat generation that survives navigation and full reload.</w:t>
       </w:r>
     </w:p>
     <w:p>
@@ -221,7 +221,7 @@
         </w:numPr>
       </w:pPr>
       <w:r>
-        <w:t xml:space="preserve">Built industry-grade audit and observability into the platform: a tamper-resistant audit trail across user and agent actions, structured error logging, and per-call AI usage and cost telemetry.</w:t>
+        <w:t xml:space="preserve">Built the audit and observability layer: a tamper-resistant audit trail across user and agent actions, structured error logging, and per-call AI usage and cost telemetry.</w:t>
       </w:r>
     </w:p>
     <w:p>
@@ -233,7 +233,7 @@
         </w:numPr>
       </w:pPr>
       <w:r>
-        <w:t xml:space="preserve">Led the platform’s UI/UX overhaul: a modern dual-UI rewrite mounted alongside the legacy app, including a full redesign of the recent-entries experience.</w:t>
+        <w:t xml:space="preserve">Led the platform’s UI/UX overhaul: a dual-UI rewrite mounted alongside the legacy app, including a full redesign of the recent-entries experience.</w:t>
       </w:r>
     </w:p>
     <w:p>
@@ -245,7 +245,7 @@
         </w:numPr>
       </w:pPr>
       <w:r>
-        <w:t xml:space="preserve">Own the full stack: React 18, Node/Express, MongoDB (27 models, ~25 route groups), JWT auth with RBAC, AWS S3, Twilio, server-side company creation with live MCA/CIN lookup, multi-format document generation (Word/Excel/PDF).</w:t>
+        <w:t xml:space="preserve">Own the full stack: React 18, Node/Express, MongoDB (34 models, 28 route groups), JWT auth with RBAC, AWS S3, Twilio, server-side company creation with live MCA/CIN lookup, multi-format document generation (Word/Excel/PDF).</w:t>
       </w:r>
     </w:p>
     <w:bookmarkEnd w:id="14"/>
@@ -443,7 +443,7 @@
         <w:t xml:space="preserve"> </w:t>
       </w:r>
       <w:r>
-        <w:t xml:space="preserve">(Rust/Tauri/Svelte, GPL-3.0) - Git review companion for AI coding editors: custom SVG commit graph, real merge-commit diffs, blame, spotlight search, worktree dashboard for multi-agent workflows.</w:t>
+        <w:t xml:space="preserve">(TypeScript/Electron/React, GPL-3.0) - Git review companion for AI coding editors: custom SVG commit graph, real merge-commit diffs, blame, spotlight search, worktree dashboard for multi-agent workflows. Re-authored off Rust/Tauri/Svelte onto a headless Node git engine (no Electron dependency, separately typechecked and tested) behind an Electron/React shell.</w:t>
       </w:r>
     </w:p>
     <w:p>
@@ -509,7 +509,7 @@
         <w:t xml:space="preserve"> </w:t>
       </w:r>
       <w:r>
-        <w:t xml:space="preserve">(TypeScript, external contributor) - Diagnosed and fixed a main-process freeze. CPU profile put 92% of self-time in synchronous fs calls under a 2s poll; established that a stalled event loop and a broken pipe are indistinguishable from the CLI. Took</w:t>
+        <w:t xml:space="preserve">(TypeScript, external contributor) - 3 PRs merged and 8 issues filed, 7 already fixed, shipped across v0.40.0 to v1.0.0. Diagnosed a main-process freeze: CPU profile put 92% of self-time in synchronous fs calls under a 2s poll; established that a stalled event loop and a broken pipe are indistinguishable from the CLI. Took</w:t>
       </w:r>
       <w:r>
         <w:t xml:space="preserve"> </w:t>
@@ -524,13 +524,13 @@
         <w:t xml:space="preserve"> </w:t>
       </w:r>
       <w:r>
-        <w:t xml:space="preserve">from timeout to 0.7ms. Merged, shipped in v0.40.0; maintainer called it</w:t>
-      </w:r>
-      <w:r>
-        <w:t xml:space="preserve"> </w:t>
-      </w:r>
-      <w:r>
-        <w:t xml:space="preserve">“one of the best bug reports this project has had”</w:t>
+        <w:t xml:space="preserve">from timeout to 0.7ms. Maintainer, on the fix:</w:t>
+      </w:r>
+      <w:r>
+        <w:t xml:space="preserve"> </w:t>
+      </w:r>
+      <w:r>
+        <w:t xml:space="preserve">“the right diagnosis and the right fix”</w:t>
       </w:r>
       <w:r>
         <w:t xml:space="preserve">.</w:t>
@@ -603,6 +603,28 @@
           <w:b/>
           <w:bCs/>
         </w:rPr>
+        <w:t xml:space="preserve">Design:</w:t>
+      </w:r>
+      <w:r>
+        <w:t xml:space="preserve"> </w:t>
+      </w:r>
+      <w:r>
+        <w:t xml:space="preserve">Figma (UI design, prototyping, dev handoff), design-system and component-library work</w:t>
+      </w:r>
+    </w:p>
+    <w:p>
+      <w:pPr>
+        <w:pStyle w:val="Compact"/>
+        <w:numPr>
+          <w:ilvl w:val="0"/>
+          <w:numId w:val="1004"/>
+        </w:numPr>
+      </w:pPr>
+      <w:r>
+        <w:rPr>
+          <w:b/>
+          <w:bCs/>
+        </w:rPr>
         <w:t xml:space="preserve">AI-assisted delivery:</w:t>
       </w:r>
       <w:r>
@@ -631,7 +653,7 @@
         <w:t xml:space="preserve"> </w:t>
       </w:r>
       <w:r>
-        <w:t xml:space="preserve">Python, Rust, Tauri, Kotlin/Android, React Native (Expo)</w:t>
+        <w:t xml:space="preserve">Python, SQL/Postgres, Rust, Tauri, Kotlin/Android, React Native (Expo)</w:t>
       </w:r>
     </w:p>
     <w:p>
@@ -653,7 +675,7 @@
         <w:t xml:space="preserve"> </w:t>
       </w:r>
       <w:r>
-        <w:t xml:space="preserve">AWS (S3), Cloudflare, GitHub Actions, Docker, PyPI/npm release automation</w:t>
+        <w:t xml:space="preserve">AWS (S3), Cloudflare, GitHub Actions, Docker, Tailscale and OpenSSH remote access, PyPI/npm release automation</w:t>
       </w:r>
     </w:p>
     <w:bookmarkEnd w:id="18"/>

</xml_diff>